<commit_message>
Batch 8: Ma 21 + Joey 21 - cross-references added - ALL BATCHES COMPLETE
</commit_message>
<xml_diff>
--- a/stories/docx/Joey 21.docx
+++ b/stories/docx/Joey 21.docx
@@ -68,6 +68,14 @@
       </w:pPr>
       <w:r>
         <w:t xml:space="preserve">I keep thinking about what is coming. Frank is coming home. I got a letter last week — he is on a ship, headed this way. His leg is hurt, but he can walk. And he is bringing Lucia with him.</w:t>
+      </w:r>
+    </w:p>
+    <w:p>
+      <w:pPr>
+        <w:pStyle w:val="BodyText"/>
+      </w:pPr>
+      <w:r>
+        <w:t xml:space="preserve">I have not had a letter from Frank in a long time. I do not know what is happening over there. I hope he is safe.</w:t>
       </w:r>
     </w:p>
     <w:p>

</xml_diff>